<commit_message>
modified chapter 9 for a few emotionsl beats added back in. Also added chapter 10.
</commit_message>
<xml_diff>
--- a/9 - The Valley That Dines.docx
+++ b/9 - The Valley That Dines.docx
@@ -158,6 +158,7 @@
         <w:keepLines/>
       </w:pPr>
       <w:r>
+        <w:lastRenderedPageBreak/>
         <w:t>Jack starts motioning the adults into the house like he is trying to herd cattle. “It’s safe and very effective. I’ll explain inside. Let’s let Lea do her thing.”</w:t>
       </w:r>
     </w:p>
@@ -247,6 +248,7 @@
         <w:keepLines/>
       </w:pPr>
       <w:r>
+        <w:lastRenderedPageBreak/>
         <w:t>It is enough to break the tension. Davey and Lisa take up one side and Frank sits at one end. Lynn places another basket of bread in front of Frank and sits at the opposite end. She motions for Jack to take the empty seat next to her. She goes to take a drink of her tea when Davey says, “Wait!”</w:t>
       </w:r>
     </w:p>
@@ -337,24 +339,41 @@
         <w:keepLines/>
       </w:pPr>
       <w:r>
-        <w:t>Jack sighs and resists the temptation to thump her on the head. “One, the wine is legit and it’s a craft handed down from at least five generations ago or more. As for the what’s in the tea, and she will put it in coffee when needed to help relieve pain, it was lavender. Gran-ma-ma was a medicine woman, and she taught Lea from before the time in the story. Lea’s favorite tea before bed is mint that grows by the lake, blackberries dried and used to sweeten it, and dried lavender to help calm and put you to sleep.”</w:t>
-      </w:r>
-    </w:p>
-    <w:p>
-      <w:pPr>
-        <w:keepNext/>
-        <w:keepLines/>
-      </w:pPr>
-      <w:r>
-        <w:t>Lisa asks, “So it’s like the Sleepytime Tea with chamomile? I thought chamomile was the sleep ingredient.”</w:t>
-      </w:r>
-    </w:p>
-    <w:p>
-      <w:pPr>
-        <w:keepNext/>
-        <w:keepLines/>
-      </w:pPr>
-      <w:r>
+        <w:t xml:space="preserve">Jack sighs and resists the temptation to thump her on the head. “One, the wine is legit and it’s a craft handed down from at least five generations ago or more. As for the what’s in the </w:t>
+      </w:r>
+      <w:proofErr w:type="gramStart"/>
+      <w:r>
+        <w:t>tea, and</w:t>
+      </w:r>
+      <w:proofErr w:type="gramEnd"/>
+      <w:r>
+        <w:t xml:space="preserve"> she will put it in coffee when needed to help relieve pain, it was lavender. Gran-ma-ma was a medicine woman, and she taught Lea from before the time in the story. Lea’s favorite tea before bed is mint that grows by the lake, blackberries dried and used to sweeten it, and dried lavender to help calm and put you to sleep.”</w:t>
+      </w:r>
+    </w:p>
+    <w:p>
+      <w:pPr>
+        <w:keepNext/>
+        <w:keepLines/>
+      </w:pPr>
+      <w:r>
+        <w:t xml:space="preserve">Lisa asks, “So it’s like the </w:t>
+      </w:r>
+      <w:proofErr w:type="spellStart"/>
+      <w:r>
+        <w:t>Sleepytime</w:t>
+      </w:r>
+      <w:proofErr w:type="spellEnd"/>
+      <w:r>
+        <w:t xml:space="preserve"> Tea with chamomile? I thought chamomile was the sleep ingredient.”</w:t>
+      </w:r>
+    </w:p>
+    <w:p>
+      <w:pPr>
+        <w:keepNext/>
+        <w:keepLines/>
+      </w:pPr>
+      <w:r>
+        <w:lastRenderedPageBreak/>
         <w:t>Jack looks at Lea as if to say, That’s your department. Lea explains, “Chamomile flowers are more of a calm, relaxing stress reliever where lavender is a true sedative. Lavender actually will numb the nervous system where chamomile just allows it to relax. Chamomile is also more effective hot, where lavender can be either hot or cold. And yes, I put it in coffee. I have arthritis in my hands and my knees, so some days I need it to help settle the pain. It’s also why I wear copper.”</w:t>
       </w:r>
     </w:p>
@@ -434,7 +453,23 @@
         <w:keepLines/>
       </w:pPr>
       <w:r>
-        <w:t>Davey almost chokes on his spaghetti and sputters, “I wasn’t the one working in cyanotype and I was just picking the blueprints up. You coulda warned a person they weren’t dry! Besides it’s much better than the spray-on tan orange you tried for that throwback eighties shoot.”</w:t>
+        <w:t xml:space="preserve">Davey almost chokes on his spaghetti and sputters, “I wasn’t the one working in cyanotype and I was just picking the blueprints up. You </w:t>
+      </w:r>
+      <w:proofErr w:type="spellStart"/>
+      <w:r>
+        <w:t>coulda</w:t>
+      </w:r>
+      <w:proofErr w:type="spellEnd"/>
+      <w:r>
+        <w:t xml:space="preserve"> warned a person they weren’t dry! Besides it’s much better than the spray-on </w:t>
+      </w:r>
+      <w:proofErr w:type="gramStart"/>
+      <w:r>
+        <w:t>tan orange</w:t>
+      </w:r>
+      <w:proofErr w:type="gramEnd"/>
+      <w:r>
+        <w:t xml:space="preserve"> you tried for that throwback eighties shoot.”</w:t>
       </w:r>
     </w:p>
     <w:p>
@@ -461,6 +496,7 @@
         <w:keepLines/>
       </w:pPr>
       <w:r>
+        <w:lastRenderedPageBreak/>
         <w:t>Lea is in her groove and fires back, “So was he auditioning for the Blue Man Group, because it’s obvious he’s trying to join the Red Hot Chili Peppers now.”</w:t>
       </w:r>
     </w:p>
@@ -589,6 +625,7 @@
         <w:keepLines/>
       </w:pPr>
       <w:r>
+        <w:lastRenderedPageBreak/>
         <w:t>Lynn feels Lea’s honesty more than she hears it. “Toby bag?”</w:t>
       </w:r>
     </w:p>
@@ -745,6 +782,7 @@
         <w:keepLines/>
       </w:pPr>
       <w:r>
+        <w:lastRenderedPageBreak/>
         <w:t xml:space="preserve">Jack shakes his head and his mischievous grin returns. “No, she didn’t do any of those. Lea paints with her voice. Most storytellers like her and myself have the cadence to do it. Think of us as narrators, because that’s what we are. Actors to some extent as well. </w:t>
       </w:r>
       <w:r>
@@ -760,7 +798,23 @@
         <w:keepLines/>
       </w:pPr>
       <w:r>
-        <w:t>Still feeling smug, Lisa leans in towards Jack, pushing further. “So we just have to find the right cadence and anyone can do it. Still doesn’t explain how she was able to put them to sleep just by painting words.”</w:t>
+        <w:t>Still feeling smug, Lisa leans in towards Jack, pushing further. “</w:t>
+      </w:r>
+      <w:proofErr w:type="gramStart"/>
+      <w:r>
+        <w:t>So</w:t>
+      </w:r>
+      <w:proofErr w:type="gramEnd"/>
+      <w:r>
+        <w:t xml:space="preserve"> we just have to find the right </w:t>
+      </w:r>
+      <w:proofErr w:type="gramStart"/>
+      <w:r>
+        <w:t>cadence</w:t>
+      </w:r>
+      <w:proofErr w:type="gramEnd"/>
+      <w:r>
+        <w:t xml:space="preserve"> and anyone can do it. Still doesn’t explain how she was able to put them to sleep just by painting words.”</w:t>
       </w:r>
     </w:p>
     <w:p>
@@ -859,6 +913,7 @@
         <w:keepLines/>
       </w:pPr>
       <w:r>
+        <w:lastRenderedPageBreak/>
         <w:t>Lea tries not to shift in her seat. She reaches for her outward indifference mask she has been trained to use since she was first cornered with being put in the spotlight like this as a child. Jack takes his sister’s hand under the table, lending her his strength and silently regretting starting this conversation. “That’s because Lea has something rarer than most. There are a very, very rare few who can bypass the mind and evoke touch in people. Most evoke a memory or trigger the imagination for the sights, smells, or sounds, but Lea makes you feel it in your skin.”</w:t>
       </w:r>
     </w:p>
@@ -878,7 +933,15 @@
         <w:t>It’s time to break the spell</w:t>
       </w:r>
       <w:r>
-        <w:t>, he thinks. “Wait, that is a little confusing. What I’m trying to say is Lea triggers you feeling her touch even when the mind knows she’s not touching you. Do you have any idea how annoying it is to have a little sister who can sit there and with a word or a look do the I’m-not-touching-you thing and absolutely make you feel her poke you? And of course, she doesn’t get in trouble because she’s not actually touching you. Parents just don’t understand.”</w:t>
+        <w:t>, he thinks. “Wait, that is a little confusing. What I’m trying to say is Lea triggers you feeling her touch even when the mind knows she’s not touching you. Do you have any idea how annoying it is to have a little sister who can sit there and with a word or a look do the I’m-not-touching-</w:t>
+      </w:r>
+      <w:proofErr w:type="gramStart"/>
+      <w:r>
+        <w:t>you thing</w:t>
+      </w:r>
+      <w:proofErr w:type="gramEnd"/>
+      <w:r>
+        <w:t xml:space="preserve"> and absolutely make you feel her poke you? And of course, she doesn’t get in trouble because she’s not actually touching you. Parents just don’t understand.”</w:t>
       </w:r>
     </w:p>
     <w:p>
@@ -923,7 +986,23 @@
         <w:keepLines/>
       </w:pPr>
       <w:r>
-        <w:t>Davey teases, “Frank and Lynn sitting in a tree k-i-s-s-i-n-g</w:t>
+        <w:t>Davey teases, “Frank and Lynn sitting in a tree k-</w:t>
+      </w:r>
+      <w:proofErr w:type="spellStart"/>
+      <w:r>
+        <w:t>i</w:t>
+      </w:r>
+      <w:proofErr w:type="spellEnd"/>
+      <w:r>
+        <w:t>-s-s-</w:t>
+      </w:r>
+      <w:proofErr w:type="spellStart"/>
+      <w:r>
+        <w:t>i</w:t>
+      </w:r>
+      <w:proofErr w:type="spellEnd"/>
+      <w:r>
+        <w:t>-n-g</w:t>
       </w:r>
       <w:r>
         <w:rPr>
@@ -959,6 +1038,7 @@
         <w:keepLines/>
       </w:pPr>
       <w:r>
+        <w:lastRenderedPageBreak/>
         <w:t>Lea smiles and says, “Both. I’m sure you have heard in Native American lore that people have animal totems. Our mother’s was the wolf. Sometimes when the spirit moves on, that person becomes their animal totem and becomes a guide. People have their core animal totem and then, other animals that show up to help guide them and guard them. The wolf, our mother, is the latter.”</w:t>
       </w:r>
     </w:p>
@@ -1040,15 +1120,24 @@
         <w:keepLines/>
       </w:pPr>
       <w:r>
-        <w:t>Davey hmphs at Frank. “Stuck like glue, baby. Because you were the only one guilible enough to pay me to get lost. I may be a runt, but I’m still faster and smarter than you. At least I’m not the only garden gnome in a flock of flamingos.”</w:t>
-      </w:r>
-    </w:p>
-    <w:p>
-      <w:pPr>
-        <w:keepNext/>
-        <w:keepLines/>
-      </w:pPr>
-      <w:r>
+        <w:t xml:space="preserve">Davey hmphs at Frank. “Stuck like glue, baby. Because you were the only one </w:t>
+      </w:r>
+      <w:proofErr w:type="spellStart"/>
+      <w:r>
+        <w:t>guilible</w:t>
+      </w:r>
+      <w:proofErr w:type="spellEnd"/>
+      <w:r>
+        <w:t xml:space="preserve"> enough to pay me to get lost. I may be a runt, but I’m still faster and smarter than you. At least I’m not the only garden gnome in a flock of flamingos.”</w:t>
+      </w:r>
+    </w:p>
+    <w:p>
+      <w:pPr>
+        <w:keepNext/>
+        <w:keepLines/>
+      </w:pPr>
+      <w:r>
+        <w:lastRenderedPageBreak/>
         <w:t>Frank does a spit-take as he picked the wrong moment to get a drink. Recovering quickly, he fires back at Davey. “Six was too much pink. Someone had to be the man because we all couldn’t be hairdressers or marry one.”</w:t>
       </w:r>
     </w:p>
@@ -1085,16 +1174,64 @@
         <w:keepLines/>
       </w:pPr>
       <w:r>
-        <w:t>Lea, half-amused with a touch of sadness replies, “The world couldn’t, and technically there were four of us. We lost River when he was forty-four along with my son, who was ten.”</w:t>
-      </w:r>
-    </w:p>
-    <w:p>
-      <w:pPr>
-        <w:keepNext/>
-        <w:keepLines/>
-      </w:pPr>
-      <w:r>
-        <w:t>Lea pivots to avoid the sadness welling up inside of her, ending in a giggle. “What is it the two of you do? Is it architecture or engineering? Because you mentioned blueprints and cyanotype earlier and is the shutterbug thing just a hobby because Davey mentioned the throwback eighties shoot and tan.”</w:t>
+        <w:t>Lea, half-amused with a touch of sadness replies, “The world couldn’t, and technically there were four of us. We lost River when he was forty-four along with my son, who was ten.</w:t>
+      </w:r>
+      <w:r>
+        <w:t xml:space="preserve"> Clay, River’s twin, is still with us, but has very little to do with me and Jack, and considers us devil spawn. He denounced our Native American heritage in favor of becoming a Baptist preacher.</w:t>
+      </w:r>
+      <w:r>
+        <w:t>”</w:t>
+      </w:r>
+    </w:p>
+    <w:p>
+      <w:pPr>
+        <w:keepNext/>
+        <w:keepLines/>
+      </w:pPr>
+      <w:r>
+        <w:t>T</w:t>
+      </w:r>
+      <w:r>
+        <w:t xml:space="preserve">he </w:t>
+      </w:r>
+      <w:r>
+        <w:t xml:space="preserve">memories and </w:t>
+      </w:r>
+      <w:r>
+        <w:t>sadness well up inside of her</w:t>
+      </w:r>
+      <w:r>
+        <w:t xml:space="preserve"> and threaten to overtake her.</w:t>
+      </w:r>
+      <w:r>
+        <w:t xml:space="preserve"> </w:t>
+      </w:r>
+      <w:r>
+        <w:t>Lea pivots</w:t>
+      </w:r>
+      <w:r>
+        <w:t xml:space="preserve"> to stop the flood, replaying the earlier banter. She asks</w:t>
+      </w:r>
+      <w:r>
+        <w:t xml:space="preserve"> </w:t>
+      </w:r>
+      <w:r>
+        <w:t xml:space="preserve">in </w:t>
+      </w:r>
+      <w:r>
+        <w:t xml:space="preserve">a </w:t>
+      </w:r>
+      <w:r>
+        <w:t>half-</w:t>
+      </w:r>
+      <w:r>
+        <w:t>giggle</w:t>
+      </w:r>
+      <w:r>
+        <w:t>,</w:t>
+      </w:r>
+      <w:r>
+        <w:t xml:space="preserve"> “What is it the two of you do? Is it architecture or engineering? Because you mentioned blueprints and cyanotype earlier and is the shutterbug thing just a hobby because Davey mentioned the throwback eighties shoot and tan.”</w:t>
       </w:r>
     </w:p>
     <w:p>
@@ -1121,7 +1258,15 @@
         <w:keepLines/>
       </w:pPr>
       <w:r>
-        <w:t>Frank nods his head in agreement. “Yup runt gofer is right. Davey sells hisself short because runt gofers see the big pattern before the rest of us do. He is great at planning and seeing where things can be smoothed out and correcting me when my wit gets sideways. That’s why he’s here, because we are in the planning stages of what this project will look like.”</w:t>
+        <w:t xml:space="preserve">Frank nods his head in agreement. “Yup runt gofer is right. Davey sells </w:t>
+      </w:r>
+      <w:proofErr w:type="gramStart"/>
+      <w:r>
+        <w:t>hisself</w:t>
+      </w:r>
+      <w:proofErr w:type="gramEnd"/>
+      <w:r>
+        <w:t xml:space="preserve"> short because runt gofers see the big pattern before the rest of us do. He is great at planning and seeing where things can be smoothed out and correcting me when my wit gets sideways. That’s why he’s here, because we are in the planning stages of what this project will look like.”</w:t>
       </w:r>
     </w:p>
     <w:p>
@@ -1139,7 +1284,16 @@
         <w:keepLines/>
       </w:pPr>
       <w:r>
-        <w:t xml:space="preserve">Frank’s anxiety returns in spades as he scans Lea’s face for any sign she is not genuine. Finding none, he finds the attraction to her grows as the anxiety dissolves. He locks eyes with her. A sudden feeling of her walking through his soul takes his breath for a moment as she unlocks and throws doors open he cannot keep closed. He relaxes. A part from deep inside his soul says, </w:t>
+        <w:lastRenderedPageBreak/>
+        <w:t xml:space="preserve">Frank’s anxiety returns in spades as he scans Lea’s face for any sign she is not genuine. Finding none, he finds the attraction to her grows as the anxiety dissolves. He locks eyes with her. A sudden feeling of her walking through his soul takes his breath for a moment as she unlocks and throws doors open he cannot keep closed. He relaxes. </w:t>
+      </w:r>
+      <w:proofErr w:type="gramStart"/>
+      <w:r>
+        <w:t>A part from</w:t>
+      </w:r>
+      <w:proofErr w:type="gramEnd"/>
+      <w:r>
+        <w:t xml:space="preserve"> deep inside his soul says, </w:t>
       </w:r>
       <w:r>
         <w:rPr>
@@ -1232,15 +1386,24 @@
         <w:keepLines/>
       </w:pPr>
       <w:r>
-        <w:t>Frank wraps his arms around his wife and kisses her on the cheek. “Oh I will definitely compare notes with you later. Sam is just as ticklish.”</w:t>
-      </w:r>
-    </w:p>
-    <w:p>
-      <w:pPr>
-        <w:keepNext/>
-        <w:keepLines/>
-      </w:pPr>
-      <w:r>
+        <w:t>Frank wraps his arms around his wife and kisses her on the cheek. “</w:t>
+      </w:r>
+      <w:proofErr w:type="gramStart"/>
+      <w:r>
+        <w:t>Oh</w:t>
+      </w:r>
+      <w:proofErr w:type="gramEnd"/>
+      <w:r>
+        <w:t xml:space="preserve"> I will definitely compare notes with you later. Sam is just as ticklish.”</w:t>
+      </w:r>
+    </w:p>
+    <w:p>
+      <w:pPr>
+        <w:keepNext/>
+        <w:keepLines/>
+      </w:pPr>
+      <w:r>
+        <w:lastRenderedPageBreak/>
         <w:t>Lea straightens, and before the men get involved in another session of how-to-torture-ticklish-wives-and-daughters, decides it’s best to end the night. “I know you three would probably talk all night if we let you, but Jack and I have a long ride back to the valley. Ladies, keep the slings, and I will bring you another set so you can carry six bottles. I’ll make some more when it gets cooler, as trying to crochet with yarn in your lap only makes the heat worse right now. It’s been wonderful meeting everyone. The food was delicious, as well as the company. We will have to do it again soon. My place next time, either in the valley or at my house on the edge of the village.”</w:t>
       </w:r>
     </w:p>
@@ -1331,6 +1494,7 @@
         <w:keepLines/>
       </w:pPr>
       <w:r>
+        <w:lastRenderedPageBreak/>
         <w:t>Everyone looks around nervously. Frank’s color changes from a ghost white to a bright pink before he recovers enough to wink and declare, “Yes. You are allowed to hug my mistress. How else am I to start my harem?”</w:t>
       </w:r>
     </w:p>
@@ -1340,7 +1504,15 @@
         <w:keepLines/>
       </w:pPr>
       <w:r>
-        <w:t>Lynn elbows Frank in the stomach before hugging Lea. “Harem? Yeah. Ain’t happening buddy. One mistress is one too many. You are more of a sister-in-law than mistress and I adopt you as such.”</w:t>
+        <w:t xml:space="preserve">Lynn elbows Frank in the stomach before hugging Lea. “Harem? Yeah. </w:t>
+      </w:r>
+      <w:proofErr w:type="spellStart"/>
+      <w:r>
+        <w:t>Ain’t</w:t>
+      </w:r>
+      <w:proofErr w:type="spellEnd"/>
+      <w:r>
+        <w:t xml:space="preserve"> happening buddy. One mistress is one too many. You are more of a sister-in-law than mistress and I adopt you as such.”</w:t>
       </w:r>
     </w:p>
     <w:p>
@@ -1422,6 +1594,7 @@
         <w:keepLines/>
       </w:pPr>
       <w:r>
+        <w:lastRenderedPageBreak/>
         <w:t xml:space="preserve">Lynn pats the back of her friend. “I think we’ll get babysitters or leave them to Kaya, Selby and Snowball. Afterall, look what frat boy stunts they have already learn from our hubbies.” </w:t>
       </w:r>
     </w:p>

</xml_diff>

<commit_message>
Final pass on Chapter 9: The Valley That Dines
</commit_message>
<xml_diff>
--- a/9 - The Valley That Dines.docx
+++ b/9 - The Valley That Dines.docx
@@ -5,31 +5,13 @@
   <w:body>
     <w:p>
       <w:pPr>
-        <w:pStyle w:val="Heading1"/>
+        <w:pStyle w:val="Heading2"/>
       </w:pPr>
       <w:bookmarkStart w:id="0" w:name="_Toc232172998"/>
       <w:bookmarkStart w:id="1" w:name="_Toc234028658"/>
       <w:bookmarkStart w:id="2" w:name="_Toc234078196"/>
       <w:r>
-        <w:t>The</w:t>
-      </w:r>
-      <w:r>
-        <w:rPr>
-          <w:spacing w:val="-28"/>
-        </w:rPr>
-        <w:t xml:space="preserve"> </w:t>
-      </w:r>
-      <w:r>
-        <w:t>Valley</w:t>
-      </w:r>
-      <w:r>
-        <w:rPr>
-          <w:spacing w:val="-26"/>
-        </w:rPr>
-        <w:t xml:space="preserve"> </w:t>
-      </w:r>
-      <w:r>
-        <w:t>That Dines</w:t>
+        <w:t>The Valley That Dines</w:t>
       </w:r>
       <w:bookmarkEnd w:id="0"/>
       <w:bookmarkEnd w:id="1"/>
@@ -135,253 +117,214 @@
           <w:i/>
           <w:iCs/>
         </w:rPr>
-        <w:t>W</w:t>
+        <w:t>Was the story too much.</w:t>
+      </w:r>
+    </w:p>
+    <w:p>
+      <w:r>
+        <w:t>Davey is juggling two glasses and two full plates of spaghetti and meatballs when he almost loses them to the floor. Kaya is eagerly waiting in front of Davey hoping for just that. Jack takes a plate and a glass and sets it on a placemat on the dining room table, noticing it has gone from a circle to an oval shape to accommodate the adults. He apologizes to Davey for Kaya and is about to drag her outside when Lea enters the dining area. Everyone jumps because no one heard her coming. She has a half apologetic smile on her face as she lowers her eyes and reaches down to take Kaya outside.</w:t>
+      </w:r>
+    </w:p>
+    <w:p>
+      <w:r>
+        <w:t>Jack calls out as she enters the den. “I swear, Sissy, one of these days we are going to put bells on you!”</w:t>
+      </w:r>
+    </w:p>
+    <w:p>
+      <w:r>
+        <w:lastRenderedPageBreak/>
+        <w:t>It is enough to break the tension. Davey and Lisa take up one side and Frank sits at one end. Lynn places another basket of bread in front of Frank and sits at the opposite end. She motions for Jack to take the empty seat next to her. She goes to take a drink of her tea when Davey says, “Wait!”</w:t>
+      </w:r>
+    </w:p>
+    <w:p>
+      <w:r>
+        <w:t>Lynn shoots him a look of disapproval before she questions, “Why?”</w:t>
+      </w:r>
+    </w:p>
+    <w:p>
+      <w:r>
+        <w:t>Davey replies sheepishly, “Who made the tea? Please tell me it wasn’t Lea.”</w:t>
+      </w:r>
+    </w:p>
+    <w:p>
+      <w:r>
+        <w:t>Lisa elbows him. “I made the tea. What’s it to you and why couldn’t Lea make it?”</w:t>
+      </w:r>
+    </w:p>
+    <w:p>
+      <w:r>
+        <w:t>Frank shakes his head. “Davey has a theory, and it’s going to upset the two of you.”</w:t>
+      </w:r>
+    </w:p>
+    <w:p>
+      <w:r>
+        <w:t>Davey crosses his arms defensively. “I’m not going to upset anyone. It’s just that Lea got us to sleep and it had to be something in the tea or the stew. And you two women are probably going to die during dinner since you drank the wine.”</w:t>
+      </w:r>
+    </w:p>
+    <w:p>
+      <w:r>
+        <w:t>Jack watches for a reaction and leans back in his chair to see Lea is chastising Kaya. He notices the concerned looks on the wives’ faces and Frank getting angry. He chuckles and cuts off any responses. “Lea did put something in the tea. It’s not poisonous or a sleeping potion… well, it might be a sleep potion… but at any rate. Davey care to explain the who-what-where-when-why you met my sister. Please.”</w:t>
+      </w:r>
+    </w:p>
+    <w:p>
+      <w:r>
+        <w:t>Davey gives Jack a doubting look and recounts the brothers’ visit in late spring. Lea smiles as she passes through on her way to wash up in the kitchen and slides in next to Jack just as Davey reveals the coffee deception. Lea smiles and nods again at him like she did that night and he almost doesn’t finish the story, trying hard not to sputter, “See I told you so.”</w:t>
+      </w:r>
+    </w:p>
+    <w:p>
+      <w:r>
+        <w:t>Lynn looks to the siblings and asks, “So what was in the coffee… I mean tea?”</w:t>
+      </w:r>
+    </w:p>
+    <w:p>
+      <w:r>
+        <w:t>Lea holds her hands up in an effort to say she’s not involved in this one.</w:t>
+      </w:r>
+    </w:p>
+    <w:p>
+      <w:r>
+        <w:t>Jack sighs and resists the temptation to thump her on the head. “One, the wine is legit and it’s a craft handed down from at least five generations ago or more. As for the what’s in the tea, and she will put it in coffee when needed to help relieve pain, it was lavender. Gran-ma-ma was a medicine woman, and she taught Lea from before the time in the story. Lea’s favorite tea before bed is mint that grows by the lake, blackberries dried and used to sweeten it, and dried lavender to help calm and put you to sleep.”</w:t>
+      </w:r>
+    </w:p>
+    <w:p>
+      <w:r>
+        <w:t>Lisa asks, “So it’s like the Sleepytime Tea with chamomile? I thought chamomile was the sleep ingredient.”</w:t>
+      </w:r>
+    </w:p>
+    <w:p>
+      <w:r>
+        <w:lastRenderedPageBreak/>
+        <w:t>Jack looks at Lea as if to say, That’s your department. Lea explains, “Chamomile flowers are more of a calm, relaxing stress reliever where lavender is a true sedative. Lavender actually will numb the nervous system where chamomile just allows it to relax. Chamomile is also more effective hot, where lavender can be either hot or cold. And yes, I put it in coffee. I have arthritis in my hands and my knees, so some days I need it to help settle the pain. It’s also why I wear copper.”</w:t>
+      </w:r>
+    </w:p>
+    <w:p>
+      <w:r>
+        <w:t>Lea holds out her hand and wrist and pushes the leather bracelets out of the way to reveal a thin serpentine copper bracelet at her wrist. Lynn looks at the green tint under the bracelet and before she can stop it, let’s slip out, “But it has turned your arm green, and it’s so dull.” Lynn immediately regrets the slip and covers her mouth with her hand.</w:t>
+      </w:r>
+    </w:p>
+    <w:p>
+      <w:r>
+        <w:t xml:space="preserve">Frank interrupts to save everyone from the cat fight. “Might I suggest we eat before this gets any colder.” He takes a bite noticing it’s not cold but also not too hot either and thinks, </w:t>
       </w:r>
       <w:r>
         <w:rPr>
           <w:i/>
           <w:iCs/>
         </w:rPr>
-        <w:t>as the story too much</w:t>
-      </w:r>
-      <w:r>
-        <w:t>.</w:t>
-      </w:r>
-    </w:p>
-    <w:p>
-      <w:r>
-        <w:t>Davey is juggling two glasses and two full plates of spaghetti and meatballs when he almost loses them to the floor. Kaya is eagerly waiting in front of Davey hoping for just that. Jack takes a plate and a glass and sets it on a placemat on the dining room table, noticing it has gone from a circle to an oval shape to accommodate the adults. He apologizes to Davey for Kaya and is about to drag her outside when Lea enters the dining area. Everyone jumps because no one heard her coming. She has a half apologetic smile on her face as she lowers her eyes and reaches down to take Kaya outside.</w:t>
-      </w:r>
-    </w:p>
-    <w:p>
-      <w:r>
-        <w:t>Jack calls out as she enters the den. “I swear, Sissy, one of these days we are going to put bells on you!”</w:t>
+        <w:t>My gawd man you are Goldilocks.</w:t>
+      </w:r>
+      <w:r>
+        <w:t xml:space="preserve"> </w:t>
+      </w:r>
+      <w:r>
+        <w:t>Everyone</w:t>
+      </w:r>
+      <w:r>
+        <w:t xml:space="preserve"> follows Frank’s lead taking bites and chewing in silence, appraising the taste before offering compliments to Frank who blushes.</w:t>
+      </w:r>
+    </w:p>
+    <w:p>
+      <w:r>
+        <w:t>Jack finishes another bite and finds the silence is still tense from Lynn’s comment. He timidly ask, “Are we allowed to talk between bites or is this a eat in silence table?”</w:t>
+      </w:r>
+    </w:p>
+    <w:p>
+      <w:r>
+        <w:t>Frank chuckles. “No, you are allowed to talk because if you have ever sat at a table with my family, quiet is the last thing you get.”</w:t>
+      </w:r>
+    </w:p>
+    <w:p>
+      <w:r>
+        <w:t>Lynn begins to apologize to Lea, but Lea doesn’t give her the chance. “It’s okay and you didn’t hurt my feelings. It’s something that most people don’t know and won’t tell you because they want to sell you on the shiny copper. The secret for it to work is in the chemistry of the oxidation of the copper. It’s the green that you want to absorb to help with arthritis, not the copper by itself, but you don’t want it unsightly green. It’s part of the reason I wear the leather bracelets on top to hide the green, but I also don’t let it get so bad that it’s unsightly. It’s a little stronger now because it’s summer and I’ve been sweating. If you want the benefits, the</w:t>
+      </w:r>
+      <w:r>
+        <w:t>n</w:t>
+      </w:r>
+      <w:r>
+        <w:t xml:space="preserve"> you have to wear off or remove the lacquer coating and then let it turn you green.”</w:t>
+      </w:r>
+    </w:p>
+    <w:p>
+      <w:r>
+        <w:t>Frank wipes his mouth with his napkin and places it back in his lap. “I guess green is an alternative to being Smurf blue. Isn’t that right, Davey?”</w:t>
+      </w:r>
+    </w:p>
+    <w:p>
+      <w:r>
+        <w:t>Davey almost chokes on his spaghetti and sputters, “I wasn’t the one working in cyanotype and I was just picking the blueprints up. You coulda warned a person they weren’t dry! Besides it’s much better than the spray-on tan orange you tried for that throwback eighties shoot.”</w:t>
+      </w:r>
+    </w:p>
+    <w:p>
+      <w:r>
+        <w:t>Lea can’t resist joining in and asks with a straight face, “Would that be George Hamilton orange or Paris Hilton orange?”</w:t>
+      </w:r>
+    </w:p>
+    <w:p>
+      <w:r>
+        <w:t>Frank smirks back, “The orange you glad you weren’t there to witness it. Now Davey’s blue, that was worth witnessing, unlike the red chili pepper he’s hitting now.”</w:t>
       </w:r>
     </w:p>
     <w:p>
       <w:r>
         <w:lastRenderedPageBreak/>
-        <w:t>It is enough to break the tension. Davey and Lisa take up one side and Frank sits at one end. Lynn places another basket of bread in front of Frank and sits at the opposite end. She motions for Jack to take the empty seat next to her. She goes to take a drink of her tea when Davey says, “Wait!”</w:t>
-      </w:r>
-    </w:p>
-    <w:p>
-      <w:r>
-        <w:t>Lynn shoots him a look of disapproval before she questions, “Why?”</w:t>
-      </w:r>
-    </w:p>
-    <w:p>
-      <w:r>
-        <w:t>Davey replies sheepishly, “Who made the tea? Please tell me it wasn’t Lea.”</w:t>
-      </w:r>
-    </w:p>
-    <w:p>
-      <w:r>
-        <w:t>Lisa elbows him. “I made the tea. What’s it to you and why couldn’t Lea make it?”</w:t>
-      </w:r>
-    </w:p>
-    <w:p>
-      <w:r>
-        <w:t>Frank shakes his head. “Davey has a theory, and it’s going to upset the two of you.”</w:t>
-      </w:r>
-    </w:p>
-    <w:p>
-      <w:r>
-        <w:t>Davey crosses his arms defensively. “I’m not going to upset anyone. It’s just that Lea got us to sleep and it had to be something in the tea or the stew. And you two women are probably going to die during dinner since you drank the wine.”</w:t>
-      </w:r>
-    </w:p>
-    <w:p>
-      <w:r>
-        <w:t>Jack watches for a reaction and leans back in his chair to see Lea is chastising Kaya. He notices the concerned looks on the wives’ faces and Frank getting angry. He chuckles and cuts off any responses. “Lea did put something in the tea. It’s not poisonous or a sleeping potion… well, it might be a sleep potion… but at any rate. Davey care to explain the who-what-where-when-why you met my sister. Please.”</w:t>
-      </w:r>
-    </w:p>
-    <w:p>
-      <w:r>
-        <w:t>Davey gives Jack a doubting look and recounts the brothers’ visit in late spring. Lea smiles as she passes through on her way to wash up in the kitchen and slides in next to Jack just as Davey reveals the coffee deception. Lea smiles and nods again at him like she did that night and he almost doesn’t finish the story, trying hard not to sputter, “See I told you so.”</w:t>
-      </w:r>
-    </w:p>
-    <w:p>
-      <w:r>
-        <w:t>Lynn looks to the siblings and asks, “So what was in the coffee… I mean tea?”</w:t>
-      </w:r>
-    </w:p>
-    <w:p>
-      <w:r>
-        <w:t>Lea holds her hands up in an effort to say she’s not involved in this one.</w:t>
-      </w:r>
-    </w:p>
-    <w:p>
-      <w:r>
-        <w:t xml:space="preserve">Jack sighs and resists the temptation to thump her on the head. “One, the wine is legit and it’s a craft handed down from at least five generations ago or more. As for the what’s in the </w:t>
-      </w:r>
-      <w:proofErr w:type="gramStart"/>
-      <w:r>
-        <w:t>tea, and</w:t>
-      </w:r>
-      <w:proofErr w:type="gramEnd"/>
-      <w:r>
-        <w:t xml:space="preserve"> she will put it in coffee when needed to help relieve pain, it was lavender. Gran-ma-ma was a medicine woman, and she taught Lea from before the time in the story. Lea’s favorite tea before bed is mint that grows by the lake, blackberries dried and used to sweeten it, and dried lavender to help calm and put you to sleep.”</w:t>
-      </w:r>
-    </w:p>
-    <w:p>
-      <w:r>
-        <w:t xml:space="preserve">Lisa asks, “So it’s like the </w:t>
-      </w:r>
-      <w:proofErr w:type="spellStart"/>
-      <w:r>
-        <w:t>Sleepytime</w:t>
-      </w:r>
-      <w:proofErr w:type="spellEnd"/>
-      <w:r>
-        <w:t xml:space="preserve"> Tea with chamomile? I thought chamomile was the sleep ingredient.”</w:t>
-      </w:r>
-    </w:p>
-    <w:p>
-      <w:r>
-        <w:lastRenderedPageBreak/>
-        <w:t>Jack looks at Lea as if to say, That’s your department. Lea explains, “Chamomile flowers are more of a calm, relaxing stress reliever where lavender is a true sedative. Lavender actually will numb the nervous system where chamomile just allows it to relax. Chamomile is also more effective hot, where lavender can be either hot or cold. And yes, I put it in coffee. I have arthritis in my hands and my knees, so some days I need it to help settle the pain. It’s also why I wear copper.”</w:t>
-      </w:r>
-    </w:p>
-    <w:p>
-      <w:r>
-        <w:t>Lea holds out her hand and wrist and pushes the leather bracelets out of the way to reveal a thin serpentine copper bracelet at her wrist. Lynn looks at the green tint under the bracelet and before she can stop it, let’s slip out, “But it has turned your arm green, and it’s so dull.” Lynn immediately regrets the slip and covers her mouth with her hand.</w:t>
-      </w:r>
-    </w:p>
-    <w:p>
-      <w:r>
-        <w:t xml:space="preserve">Frank interrupts to save everyone from the cat fight. “Might I suggest we eat before this gets any colder.” He takes a bite noticing it’s not cold but also not too hot either and thinks, </w:t>
+        <w:t>Lea is in her groove and fires back, “So was he auditioning for the Blue Man Group, because it’s obvious he’s trying to join the Red Hot Chili Peppers now.”</w:t>
+      </w:r>
+    </w:p>
+    <w:p>
+      <w:r>
+        <w:t>Jack scoots his chair closer to Lynn and motions for Lisa to do the same. He whispers, “I’ve seen this before and it’s best if we stick together and try not to draw attention to ourselves and enjoy the show.”</w:t>
+      </w:r>
+    </w:p>
+    <w:p>
+      <w:r>
+        <w:t>Frank, feeling alive and sparking inside, keeps the banter going. “It’s possible. Blue Man Group would be a possibility. Red Hot Chili Peppers… maybe he could replace Flea. He does have the stature of a flea I mean.”</w:t>
+      </w:r>
+    </w:p>
+    <w:p>
+      <w:r>
+        <w:t>Lea continues the thought, “Yeah he does have the flea stature, but look, he’s getting purple now. He might be better suited to Prince for an audition for Purple Rain, especially if he starts crying.”</w:t>
+      </w:r>
+    </w:p>
+    <w:p>
+      <w:r>
+        <w:t>Frank trying to keep it in, lands one more jab at Davey. “If he does start crying, we’ll need a Yellow Submarine to survive the Ocean Rain.”</w:t>
+      </w:r>
+    </w:p>
+    <w:p>
+      <w:r>
+        <w:t>Lea and Frank, watching Davey’s eyes twitch trying to defend himself, finally fails. Davey finds his voice, and blunders out, “What do you two think I am, a bag of Skittles? I’m not a fucking rainbow!”</w:t>
+      </w:r>
+    </w:p>
+    <w:p>
+      <w:r>
+        <w:t xml:space="preserve">His outburst breaks both Lea and Frank down as they let go of the laughter they had been suppressing. Jack and the wives join in. Frank thinks to himself, </w:t>
       </w:r>
       <w:r>
         <w:rPr>
           <w:i/>
           <w:iCs/>
         </w:rPr>
-        <w:t>My gawd man you are Goldilocks</w:t>
-      </w:r>
-      <w:r>
-        <w:t xml:space="preserve">. </w:t>
-      </w:r>
-      <w:r>
-        <w:t>Everyone</w:t>
-      </w:r>
-      <w:r>
-        <w:t xml:space="preserve"> follows Frank’s lead taking bites and chewing in silence, appraising the taste before offering compliments to Frank who blushes.</w:t>
-      </w:r>
-    </w:p>
-    <w:p>
-      <w:r>
-        <w:t>Jack finishes another bite and finds the silence is still tense from Lynn’s comment. He timidly ask, “Are we allowed to talk between bites or is this a eat in silence table?”</w:t>
-      </w:r>
-    </w:p>
-    <w:p>
-      <w:r>
-        <w:t>Frank chuckles. “No, you are allowed to talk because if you have ever sat at a table with my family, quiet is the last thing you get.”</w:t>
-      </w:r>
-    </w:p>
-    <w:p>
-      <w:r>
-        <w:t>Lynn begins to apologize to Lea, but Lea doesn’t give her the chance. “It’s okay and you didn’t hurt my feelings. It’s something that most people don’t know and won’t tell you because they want to sell you on the shiny copper. The secret for it to work is in the chemistry of the oxidation of the copper. It’s the green that you want to absorb to help with arthritis, not the copper by itself, but you don’t want it unsightly green. It’s part of the reason I wear the leather bracelets on top to hide the green, but I also don’t let it get so bad that it’s unsightly. It’s a little stronger now because it’s summer and I’ve been sweating. If you want the benefits, the you have to wear off or remove the lacquer coating and then let it turn you green.”</w:t>
-      </w:r>
-    </w:p>
-    <w:p>
-      <w:r>
-        <w:t>Frank wipes his mouth with his napkin and places it back in his lap. “I guess green is an alternative to being Smurf blue. Isn’t that right, Davey?”</w:t>
-      </w:r>
-    </w:p>
-    <w:p>
-      <w:r>
-        <w:t xml:space="preserve">Davey almost chokes on his spaghetti and sputters, “I wasn’t the one working in cyanotype and I was just picking the blueprints up. You </w:t>
-      </w:r>
-      <w:proofErr w:type="spellStart"/>
-      <w:r>
-        <w:t>coulda</w:t>
-      </w:r>
-      <w:proofErr w:type="spellEnd"/>
-      <w:r>
-        <w:t xml:space="preserve"> warned a person they weren’t dry! Besides it’s much better than the spray-on </w:t>
-      </w:r>
-      <w:proofErr w:type="gramStart"/>
-      <w:r>
-        <w:t>tan orange</w:t>
-      </w:r>
-      <w:proofErr w:type="gramEnd"/>
-      <w:r>
-        <w:t xml:space="preserve"> you tried for that throwback eighties shoot.”</w:t>
-      </w:r>
-    </w:p>
-    <w:p>
-      <w:r>
-        <w:t>Lea can’t resist joining in and asks with a straight face, “Would that be George Hamilton orange or Paris Hilton orange?”</w:t>
-      </w:r>
-    </w:p>
-    <w:p>
-      <w:r>
-        <w:t>Frank smirks back, “The orange you glad you weren’t there to witness it. Now Davey’s blue, that was worth witnessing, unlike the red chili pepper he’s hitting now.”</w:t>
-      </w:r>
-    </w:p>
-    <w:p>
-      <w:r>
-        <w:lastRenderedPageBreak/>
-        <w:t>Lea is in her groove and fires back, “So was he auditioning for the Blue Man Group, because it’s obvious he’s trying to join the Red Hot Chili Peppers now.”</w:t>
-      </w:r>
-    </w:p>
-    <w:p>
-      <w:r>
-        <w:t>Jack scoots his chair closer to Lynn and motions for Lisa to do the same. He whispers, “I’ve seen this before and it’s best if we stick together and try not to draw attention to ourselves and enjoy the show.”</w:t>
-      </w:r>
-    </w:p>
-    <w:p>
-      <w:r>
-        <w:t>Frank, feeling alive and sparking inside, keeps the banter going. “It’s possible. Blue Man Group would be a possibility. Red Hot Chili Peppers… maybe he could replace Flea. He does have the stature of a flea I mean.”</w:t>
-      </w:r>
-    </w:p>
-    <w:p>
-      <w:r>
-        <w:t>Lea continues the thought, “Yeah he does have the flea stature, but look, he’s getting purple now. He might be better suited to Prince for an audition for Purple Rain, especially if he starts crying.”</w:t>
-      </w:r>
-    </w:p>
-    <w:p>
-      <w:r>
-        <w:t>Frank trying to keep it in, lands one more jab at Davey. “If he does start crying, we’ll need a Yellow Submarine to survive the Ocean Rain.”</w:t>
-      </w:r>
-    </w:p>
-    <w:p>
-      <w:r>
-        <w:t>Lea and Frank, watching Davey’s eyes twitch trying to defend himself, finally fails. Davey finds his voice, and blunders out, “What do you two think I am, a bag of Skittles? I’m not a fucking rainbow!”</w:t>
-      </w:r>
-    </w:p>
-    <w:p>
-      <w:r>
-        <w:t xml:space="preserve">His outburst breaks both Lea and Frank down as they let go of the laughter they had been suppressing. Jack and the wives join in. Frank thinks to himself, </w:t>
+        <w:t>I’m back.</w:t>
+      </w:r>
+    </w:p>
+    <w:p>
+      <w:r>
+        <w:t>Wiping tears from their eyes and the sighs of trying to calm to infectious laughter, Jack and Lisa move their chairs back over to try to finish their meal. The others follow their lead, but a giggle or a snort slips out in the silence. Lynn watches Frank lean over to look out at the patio, making sure the laughter did not wake the kids. She gives him a questioning look, and he nods all is okay. It reminds her that Jack was supposed to explain Lea’s bedtime spell.</w:t>
+      </w:r>
+    </w:p>
+    <w:p>
+      <w:r>
+        <w:t xml:space="preserve">Lynn sees the plates are nearly empty as well as the tea glasses and rises, grabbing the pitcher from the bar and topping off glasses starting with Jack and working clockwise around the table. She thinks to herself, </w:t>
       </w:r>
       <w:r>
         <w:rPr>
           <w:i/>
           <w:iCs/>
         </w:rPr>
-        <w:t>I’m back</w:t>
-      </w:r>
-      <w:r>
-        <w:t>.</w:t>
-      </w:r>
-    </w:p>
-    <w:p>
-      <w:r>
-        <w:t>Wiping tears from their eyes and the sighs of trying to calm to infectious laughter, Jack and Lisa move their chairs back over to try to finish their meal. The others follow their lead, but a giggle or a snort slips out in the silence. Lynn watches Frank lean over to look out at the patio, making sure the laughter did not wake the kids. She gives him a questioning look, and he nods all is okay. It reminds her that Jack was supposed to explain Lea’s bedtime spell.</w:t>
-      </w:r>
-    </w:p>
-    <w:p>
-      <w:r>
-        <w:t xml:space="preserve">Lynn sees the plates are nearly empty as well as the tea glasses and rises, grabbing the pitcher from the bar and topping off glasses starting with Jack and working clockwise around the table. She thinks to herself, </w:t>
-      </w:r>
-      <w:r>
-        <w:rPr>
-          <w:i/>
-          <w:iCs/>
-        </w:rPr>
-        <w:t>I guess you can take the waitress out of the diner, but you can’t take her out of the girl</w:t>
-      </w:r>
-      <w:r>
-        <w:t>. She gets to Davey and chuckles again at the rainbow punnery that flew around this end of the table and asks Davey, “Would you like a side of lavender with that.”</w:t>
+        <w:t>I guess you can take the waitress out of the diner, but you can’t take her out of the girl.</w:t>
+      </w:r>
+      <w:r>
+        <w:t xml:space="preserve"> She gets to Davey and chuckles again at the rainbow punnery that flew around this end of the table and asks Davey, “Would you like a side of lavender with that.”</w:t>
       </w:r>
     </w:p>
     <w:p>
@@ -526,23 +469,7 @@
     </w:p>
     <w:p>
       <w:r>
-        <w:t>Still feeling smug, Lisa leans in towards Jack, pushing further. “</w:t>
-      </w:r>
-      <w:proofErr w:type="gramStart"/>
-      <w:r>
-        <w:t>So</w:t>
-      </w:r>
-      <w:proofErr w:type="gramEnd"/>
-      <w:r>
-        <w:t xml:space="preserve"> we just have to find the right </w:t>
-      </w:r>
-      <w:proofErr w:type="gramStart"/>
-      <w:r>
-        <w:t>cadence</w:t>
-      </w:r>
-      <w:proofErr w:type="gramEnd"/>
-      <w:r>
-        <w:t xml:space="preserve"> and anyone can do it. Still doesn’t explain how she was able to put them to sleep just by painting words.”</w:t>
+        <w:t>Still feeling smug, Lisa leans in towards Jack, pushing further. “So we just have to find the right cadence and anyone can do it. Still doesn’t explain how she was able to put them to sleep just by painting words.”</w:t>
       </w:r>
     </w:p>
     <w:p>
@@ -626,18 +553,10 @@
           <w:i/>
           <w:iCs/>
         </w:rPr>
-        <w:t>It’s time to break the spell</w:t>
-      </w:r>
-      <w:r>
-        <w:t>, he thinks. “Wait, that is a little confusing. What I’m trying to say is Lea triggers you feeling her touch even when the mind knows she’s not touching you. Do you have any idea how annoying it is to have a little sister who can sit there and with a word or a look do the I’m-not-touching-</w:t>
-      </w:r>
-      <w:proofErr w:type="gramStart"/>
-      <w:r>
-        <w:t>you thing</w:t>
-      </w:r>
-      <w:proofErr w:type="gramEnd"/>
-      <w:r>
-        <w:t xml:space="preserve"> and absolutely make you feel her poke you? And of course, she doesn’t get in trouble because she’s not actually touching you. Parents just don’t understand.”</w:t>
+        <w:t>It’s time to break the spell,</w:t>
+      </w:r>
+      <w:r>
+        <w:t xml:space="preserve"> he thinks. “Wait, that is a little confusing. What I’m trying to say is Lea triggers you feeling her touch even when the mind knows she’s not touching you. Do you have any idea how annoying it is to have a little sister who can sit there and with a word or a look do the I’m-not-touching-you thing and absolutely make you feel her poke you? And of course, she doesn’t get in trouble because she’s not actually touching you. Parents just don’t understand.”</w:t>
       </w:r>
     </w:p>
     <w:p>
@@ -662,23 +581,7 @@
     </w:p>
     <w:p>
       <w:r>
-        <w:t>Davey teases, “Frank and Lynn sitting in a tree k-</w:t>
-      </w:r>
-      <w:proofErr w:type="spellStart"/>
-      <w:r>
-        <w:t>i</w:t>
-      </w:r>
-      <w:proofErr w:type="spellEnd"/>
-      <w:r>
-        <w:t>-s-s-</w:t>
-      </w:r>
-      <w:proofErr w:type="spellStart"/>
-      <w:r>
-        <w:t>i</w:t>
-      </w:r>
-      <w:proofErr w:type="spellEnd"/>
-      <w:r>
-        <w:t>-n-g</w:t>
+        <w:t>Davey teases, “Frank and Lynn sitting in a tree k-i-s-s-i-n-g</w:t>
       </w:r>
       <w:r>
         <w:rPr>
@@ -845,15 +748,7 @@
     </w:p>
     <w:p>
       <w:r>
-        <w:t xml:space="preserve">Frank nods his head in agreement. “Yup runt gofer is right. Davey sells </w:t>
-      </w:r>
-      <w:proofErr w:type="gramStart"/>
-      <w:r>
-        <w:t>hisself</w:t>
-      </w:r>
-      <w:proofErr w:type="gramEnd"/>
-      <w:r>
-        <w:t xml:space="preserve"> short because runt gofers see the big pattern before the rest of us do. He is great at planning and seeing where things can be smoothed out and correcting me when my wit gets sideways. That’s why he’s here, because we are in the planning stages of what this project will look like.”</w:t>
+        <w:t>Frank nods his head in agreement. “Yup runt gofer is right. Davey sells hisself short because runt gofers see the big pattern before the rest of us do. He is great at planning and seeing where things can be smoothed out and correcting me when my wit gets sideways. That’s why he’s here, because we are in the planning stages of what this project will look like.”</w:t>
       </w:r>
     </w:p>
     <w:p>
@@ -864,38 +759,22 @@
     <w:p>
       <w:r>
         <w:lastRenderedPageBreak/>
-        <w:t xml:space="preserve">Frank’s anxiety returns in spades as he scans Lea’s face for any sign she is not genuine. Finding none, he finds the attraction to her grows as the anxiety dissolves. He locks eyes with her. A sudden feeling of her walking through his soul takes his breath for a moment as she unlocks and throws doors open he cannot keep closed. He relaxes. </w:t>
-      </w:r>
-      <w:proofErr w:type="gramStart"/>
-      <w:r>
-        <w:t>A part from</w:t>
-      </w:r>
-      <w:proofErr w:type="gramEnd"/>
-      <w:r>
-        <w:t xml:space="preserve"> deep inside his soul says, </w:t>
+        <w:t xml:space="preserve">Frank’s anxiety returns in spades as he scans Lea’s face for any sign she is not genuine. Finding none, he finds the attraction to her grows as the anxiety dissolves. He locks eyes with her. A sudden feeling of her walking through his soul takes his breath for a moment as she unlocks and throws doors open he cannot keep closed. He relaxes. A part from deep inside his soul says, </w:t>
       </w:r>
       <w:r>
         <w:rPr>
           <w:i/>
           <w:iCs/>
         </w:rPr>
-        <w:t>I know you, old friend</w:t>
-      </w:r>
-      <w:r>
-        <w:t>. He relaxes when he discovers to his delight he is doing the same thing to her seeing the real woman and not the mythic shape shifting being, more wisdom than could ever be fully realized. A woman who is somehow still a child that has known joy, great loss, grief, self-doubt, challenges, and love. He pauses on love as he hears his wife’s laughter from the kitchen. What he feels for Lea is not romantic but something on a deeper level he still cannot define.</w:t>
-      </w:r>
-    </w:p>
-    <w:p>
-      <w:r>
-        <w:t xml:space="preserve">The clock chimes eleven, </w:t>
-      </w:r>
-      <w:proofErr w:type="gramStart"/>
-      <w:r>
-        <w:t>breaking the spell</w:t>
-      </w:r>
-      <w:proofErr w:type="gramEnd"/>
-      <w:r>
-        <w:t xml:space="preserve"> they were under. The last note lingers, as they slowly turn to acknowledge the squeal of laughter coming from the kitchen island bar where Lynn, Lisa, and Jack sit. Davey, knowing his wife is stirring the pot, finalizes the moment by nervously saying, “I think we need to rescue Jack.”</w:t>
+        <w:t>I know you, old friend.</w:t>
+      </w:r>
+      <w:r>
+        <w:t xml:space="preserve"> He relaxes when he discovers to his delight he is doing the same thing to her seeing the real woman and not the mythic shape shifting being, more wisdom than could ever be fully realized. A woman who is somehow still a child that has known joy, great loss, grief, self-doubt, challenges, and love. He pauses on love as he hears his wife’s laughter from the kitchen. What he feels for Lea is not romantic but something on a deeper level he still cannot define.</w:t>
+      </w:r>
+    </w:p>
+    <w:p>
+      <w:r>
+        <w:t>The clock chimes eleven, breaking the spell they were under. The last note lingers, as they slowly turn to acknowledge the squeal of laughter coming from the kitchen island bar where Lynn, Lisa, and Jack sit. Davey, knowing his wife is stirring the pot, finalizes the moment by nervously saying, “I think we need to rescue Jack.”</w:t>
       </w:r>
     </w:p>
     <w:p>
@@ -917,20 +796,17 @@
           <w:i/>
           <w:iCs/>
         </w:rPr>
-        <w:t>what did you do now</w:t>
-      </w:r>
-      <w:r>
-        <w:t xml:space="preserve">. Lisa feigns innocence as she drinks the last of her wine. Frank walks behind his wife, knowing exactly that tone of laughter. He begins to run his fingers lightly down her sides, making her squeal with more laughter. He thinks, </w:t>
+        <w:t>what did you do now.</w:t>
+      </w:r>
+      <w:r>
+        <w:t xml:space="preserve"> Lisa feigns innocence as she drinks the last of her wine. Frank walks behind his wife, knowing exactly that tone of laughter. He begins to run his fingers lightly down her sides, making her squeal with more laughter. He thinks, </w:t>
       </w:r>
       <w:r>
         <w:rPr>
           <w:i/>
           <w:iCs/>
         </w:rPr>
-        <w:t>It’s a good day I got them both</w:t>
-      </w:r>
-      <w:r>
-        <w:t>.</w:t>
+        <w:t>It’s a good day I got them both.</w:t>
       </w:r>
     </w:p>
     <w:p>
@@ -945,15 +821,7 @@
     </w:p>
     <w:p>
       <w:r>
-        <w:t>Frank wraps his arms around his wife and kisses her on the cheek. “</w:t>
-      </w:r>
-      <w:proofErr w:type="gramStart"/>
-      <w:r>
-        <w:t>Oh</w:t>
-      </w:r>
-      <w:proofErr w:type="gramEnd"/>
-      <w:r>
-        <w:t xml:space="preserve"> I will definitely compare notes with you later. Sam is just as ticklish.”</w:t>
+        <w:t>Frank wraps his arms around his wife and kisses her on the cheek. “Oh I will definitely compare notes with you later. Sam is just as ticklish.”</w:t>
       </w:r>
     </w:p>
     <w:p>
@@ -1015,15 +883,7 @@
     </w:p>
     <w:p>
       <w:r>
-        <w:t xml:space="preserve">Lynn elbows Frank in the stomach before hugging Lea. “Harem? Yeah. </w:t>
-      </w:r>
-      <w:proofErr w:type="spellStart"/>
-      <w:r>
-        <w:t>Ain’t</w:t>
-      </w:r>
-      <w:proofErr w:type="spellEnd"/>
-      <w:r>
-        <w:t xml:space="preserve"> happening buddy. One mistress is one too many. You are more of a sister-in-law than mistress and I adopt you as such.”</w:t>
+        <w:t>Lynn elbows Frank in the stomach before hugging Lea. “Harem? Yeah. Ain’t happening buddy. One mistress is one too many. You are more of a sister-in-law than mistress and I adopt you as such.”</w:t>
       </w:r>
     </w:p>
     <w:p>
@@ -1050,10 +910,10 @@
           <w:i/>
           <w:iCs/>
         </w:rPr>
-        <w:t>Too much. Too fast. I’m not ready</w:t>
-      </w:r>
-      <w:r>
-        <w:t>. She takes a deep breath and lets it out slowly. Very softly and just above a whisper, she says, “I dunno. I’ll think about it.”</w:t>
+        <w:t>Too much. Too fast. I’m not ready.</w:t>
+      </w:r>
+      <w:r>
+        <w:t xml:space="preserve"> She takes a deep breath and lets it out slowly. Very softly and just above a whisper, she says, “I dunno. I’ll think about it.”</w:t>
       </w:r>
     </w:p>
     <w:p>
@@ -1671,7 +1531,7 @@
   <w:style w:type="paragraph" w:default="1" w:styleId="Normal">
     <w:name w:val="Normal"/>
     <w:qFormat/>
-    <w:rsid w:val="00022C0C"/>
+    <w:rsid w:val="00CE7A35"/>
     <w:pPr>
       <w:keepNext/>
       <w:keepLines/>
@@ -1705,18 +1565,19 @@
     <w:basedOn w:val="Normal"/>
     <w:next w:val="Normal"/>
     <w:link w:val="Heading2Char"/>
+    <w:autoRedefine/>
     <w:uiPriority w:val="9"/>
-    <w:semiHidden/>
     <w:unhideWhenUsed/>
     <w:qFormat/>
-    <w:rsid w:val="00DB6459"/>
+    <w:rsid w:val="00CE7A35"/>
     <w:pPr>
-      <w:spacing w:before="160" w:after="80"/>
+      <w:spacing w:after="240"/>
+      <w:jc w:val="center"/>
       <w:outlineLvl w:val="1"/>
     </w:pPr>
     <w:rPr>
       <w:rFonts w:eastAsiaTheme="majorEastAsia" w:cstheme="majorBidi"/>
-      <w:sz w:val="32"/>
+      <w:sz w:val="56"/>
       <w:szCs w:val="32"/>
     </w:rPr>
   </w:style>
@@ -1893,11 +1754,10 @@
     <w:basedOn w:val="DefaultParagraphFont"/>
     <w:link w:val="Heading2"/>
     <w:uiPriority w:val="9"/>
-    <w:semiHidden/>
-    <w:rsid w:val="00DB6459"/>
+    <w:rsid w:val="00CE7A35"/>
     <w:rPr>
       <w:rFonts w:ascii="Times New Roman" w:eastAsiaTheme="majorEastAsia" w:hAnsi="Times New Roman" w:cstheme="majorBidi"/>
-      <w:sz w:val="32"/>
+      <w:sz w:val="56"/>
       <w:szCs w:val="32"/>
     </w:rPr>
   </w:style>

</xml_diff>